<commit_message>
SOW notes that UI illustrations are available on request but non-binding
Co-Authored-By: Claude Opus 4.6 <noreply@anthropic.com>
</commit_message>
<xml_diff>
--- a/SOW.docx
+++ b/SOW.docx
@@ -1364,6 +1364,17 @@
       </w:tr>
     </w:tbl>
     <w:p/>
+    <w:p>
+      <w:r>
+        <w:rPr>
+          <w:b/>
+        </w:rPr>
+        <w:t>Illustrative material.</w:t>
+      </w:r>
+      <w:r>
+        <w:t xml:space="preserve"> A product overview containing screenshots of the application interface is available on request for evaluation purposes. It is not a contractual deliverable, forms no part of the acceptance criteria in Section 10, and the interface shown may differ from the build delivered under this POC.</w:t>
+      </w:r>
+    </w:p>
     <w:p>
       <w:pPr>
         <w:pStyle w:val="Heading1"/>

</xml_diff>